<commit_message>
Updated PT version of consent form after feedback
</commit_message>
<xml_diff>
--- a/irb/pt_nj_consent_draft.docx
+++ b/irb/pt_nj_consent_draft.docx
@@ -12,7 +12,7 @@
           <w:rFonts w:ascii="Times New Roman" w:eastAsia="Times" w:hAnsi="Times New Roman" w:cs="Times New Roman"/>
           <w:b/>
           <w:bCs/>
-          <w:lang w:val="es-ES"/>
+          <w:lang w:val="pt-BR"/>
         </w:rPr>
       </w:pPr>
       <w:r>
@@ -20,9 +20,27 @@
           <w:rFonts w:ascii="Times New Roman" w:eastAsia="Times" w:hAnsi="Times New Roman" w:cs="Times New Roman"/>
           <w:b/>
           <w:bCs/>
-          <w:lang w:val="es-ES"/>
-        </w:rPr>
-        <w:t>CONSENTIMIENTO PARA PARTICIPAR EN UN ESTUDIO DE INVESTIGACIÓN</w:t>
+          <w:lang w:val="pt-BR"/>
+        </w:rPr>
+        <w:t>CONSENTIMENTO PARA PARTICIPAR</w:t>
+      </w:r>
+      <w:r>
+        <w:rPr>
+          <w:rFonts w:ascii="Times New Roman" w:eastAsia="Times" w:hAnsi="Times New Roman" w:cs="Times New Roman"/>
+          <w:b/>
+          <w:bCs/>
+          <w:lang w:val="pt-BR"/>
+        </w:rPr>
+        <w:t xml:space="preserve"> </w:t>
+      </w:r>
+      <w:r>
+        <w:rPr>
+          <w:rFonts w:ascii="Times New Roman" w:eastAsia="Times" w:hAnsi="Times New Roman" w:cs="Times New Roman"/>
+          <w:b/>
+          <w:bCs/>
+          <w:lang w:val="pt-BR"/>
+        </w:rPr>
+        <w:t>EM PESQUISA</w:t>
       </w:r>
     </w:p>
     <w:p>
@@ -173,7 +191,23 @@
           <w:rFonts w:ascii="Times New Roman" w:hAnsi="Times New Roman" w:cs="Times New Roman"/>
           <w:lang w:val="pt-BR"/>
         </w:rPr>
-        <w:t>Este estudo de pesquisa está sendo conduzido por Robert Esposito, doutorando no Departamento de Espanhol e Português da Universidade Rutgers, e pela Dra. Kendra Dickinson, Professora Assistente da mesma instituição. O objetivo deste estudo é compreender melhor como falantes de português em Nova Jersey usam a língua.</w:t>
+        <w:t xml:space="preserve">Este estudo de pesquisa está sendo conduzido por Robert Esposito, doutorando no Departamento de Espanhol e </w:t>
+      </w:r>
+      <w:proofErr w:type="gramStart"/>
+      <w:r>
+        <w:rPr>
+          <w:rFonts w:ascii="Times New Roman" w:hAnsi="Times New Roman" w:cs="Times New Roman"/>
+          <w:lang w:val="pt-BR"/>
+        </w:rPr>
+        <w:t>Português</w:t>
+      </w:r>
+      <w:proofErr w:type="gramEnd"/>
+      <w:r>
+        <w:rPr>
+          <w:rFonts w:ascii="Times New Roman" w:hAnsi="Times New Roman" w:cs="Times New Roman"/>
+          <w:lang w:val="pt-BR"/>
+        </w:rPr>
+        <w:t xml:space="preserve"> da Universidade Rutgers, e pela Dra. Kendra Dickinson, Professora Assistente da mesma instituição. O objetivo deste estudo é compreender melhor como falantes de português em Nova Jersey usam a língua.</w:t>
       </w:r>
     </w:p>
     <w:p>
@@ -220,7 +254,56 @@
           <w:rFonts w:ascii="Times New Roman" w:eastAsia="Times New Roman" w:hAnsi="Times New Roman" w:cs="Times New Roman"/>
           <w:lang w:val="pt-BR" w:eastAsia="en-US"/>
         </w:rPr>
-        <w:t>Sua participação levará aproximadamente 45 minutos. O estudo inclui várias seções, que você completará com o acompanhamento do pesquisador. Você será solicitado(a) a ler uma série de frases em voz alta, recontar uma história curta com suas próprias palavras e responder a perguntas sobre como você usa a língua. Também responderá algumas perguntas demográficas gerais sobre você, como idade, local de Nascimento, e outras informações semelhantes.</w:t>
+        <w:t>Sua participação levará aproximadamente 45 minutos. O estudo inclui várias seções, que você completará com o acompanhamento do pesquisador. Você será solicitado(a) a ler uma série de frases em voz alta, recontar uma história curta com suas próprias palavras e responder perguntas sobre como você usa a língua. Também responderá algumas perguntas demográficas gerais sobre você, como</w:t>
+      </w:r>
+      <w:r>
+        <w:rPr>
+          <w:rFonts w:ascii="Times New Roman" w:eastAsia="Times New Roman" w:hAnsi="Times New Roman" w:cs="Times New Roman"/>
+          <w:lang w:val="pt-BR" w:eastAsia="en-US"/>
+        </w:rPr>
+        <w:t xml:space="preserve"> a sua</w:t>
+      </w:r>
+      <w:r>
+        <w:rPr>
+          <w:rFonts w:ascii="Times New Roman" w:eastAsia="Times New Roman" w:hAnsi="Times New Roman" w:cs="Times New Roman"/>
+          <w:lang w:val="pt-BR" w:eastAsia="en-US"/>
+        </w:rPr>
+        <w:t xml:space="preserve"> idade, </w:t>
+      </w:r>
+      <w:r>
+        <w:rPr>
+          <w:rFonts w:ascii="Times New Roman" w:eastAsia="Times New Roman" w:hAnsi="Times New Roman" w:cs="Times New Roman"/>
+          <w:lang w:val="pt-BR" w:eastAsia="en-US"/>
+        </w:rPr>
+        <w:t>seu lugar</w:t>
+      </w:r>
+      <w:r>
+        <w:rPr>
+          <w:rFonts w:ascii="Times New Roman" w:eastAsia="Times New Roman" w:hAnsi="Times New Roman" w:cs="Times New Roman"/>
+          <w:lang w:val="pt-BR" w:eastAsia="en-US"/>
+        </w:rPr>
+        <w:t xml:space="preserve"> </w:t>
+      </w:r>
+      <w:r>
+        <w:rPr>
+          <w:rFonts w:ascii="Times New Roman" w:eastAsia="Times New Roman" w:hAnsi="Times New Roman" w:cs="Times New Roman"/>
+          <w:lang w:val="pt-BR" w:eastAsia="en-US"/>
+        </w:rPr>
+        <w:t xml:space="preserve">de </w:t>
+      </w:r>
+      <w:r>
+        <w:rPr>
+          <w:rFonts w:ascii="Times New Roman" w:eastAsia="Times New Roman" w:hAnsi="Times New Roman" w:cs="Times New Roman"/>
+          <w:lang w:val="pt-BR" w:eastAsia="en-US"/>
+        </w:rPr>
+        <w:t>n</w:t>
+      </w:r>
+      <w:r>
+        <w:rPr>
+          <w:rFonts w:ascii="Times New Roman" w:eastAsia="Times New Roman" w:hAnsi="Times New Roman" w:cs="Times New Roman"/>
+          <w:lang w:val="pt-BR" w:eastAsia="en-US"/>
+        </w:rPr>
+        <w:t>ascimento e outras informações semelhantes.</w:t>
       </w:r>
     </w:p>
     <w:p>
@@ -266,7 +349,55 @@
         <w:rPr>
           <w:lang w:val="pt-BR"/>
         </w:rPr>
-        <w:t>Não há riscos conhecidos associados à participação neste estudo. No entanto, algumas perguntas podem fazer com que você se sinta desconfortável. Se isso acontecer, você pode decidir não responder a essas perguntas ou retirar-se completamente do estudo. Você não é obrigado(a) a responder a perguntas que o(a) deixem desconfortável, e pode informar ao entrevistador que não deseja responder a qualquer pergunta. Se você decidir interromper a entrevista, suas respostas NÃO serão salvas. O risco de violação de confidencialidade é um possível dano em qualquer estudo, mas foi implementado um plano de segurança de dados para minimizar esse risco.</w:t>
+        <w:t xml:space="preserve">Não há riscos conhecidos associados à participação </w:t>
+      </w:r>
+      <w:r>
+        <w:rPr>
+          <w:lang w:val="pt-BR"/>
+        </w:rPr>
+        <w:t>d</w:t>
+      </w:r>
+      <w:r>
+        <w:rPr>
+          <w:lang w:val="pt-BR"/>
+        </w:rPr>
+        <w:t xml:space="preserve">este estudo. No entanto, algumas perguntas podem fazer </w:t>
+      </w:r>
+      <w:r>
+        <w:rPr>
+          <w:lang w:val="pt-BR"/>
+        </w:rPr>
+        <w:t>algum desconforto para você</w:t>
+      </w:r>
+      <w:r>
+        <w:rPr>
+          <w:lang w:val="pt-BR"/>
+        </w:rPr>
+        <w:t xml:space="preserve">. Se isso acontecer, você pode decidir não responder essas perguntas ou retirar-se completamente do estudo. Você não é obrigado(a) a responder perguntas que o(a) deixem desconfortável, e pode informar ao entrevistador que não deseja responder a qualquer pergunta. Se você decidir interromper a entrevista, suas respostas NÃO serão salvas. O risco de violação de confidencialidade é um possível dano em qualquer estudo, mas </w:t>
+      </w:r>
+      <w:r>
+        <w:rPr>
+          <w:lang w:val="pt-BR"/>
+        </w:rPr>
+        <w:t xml:space="preserve">já </w:t>
+      </w:r>
+      <w:r>
+        <w:rPr>
+          <w:lang w:val="pt-BR"/>
+        </w:rPr>
+        <w:t>implementa</w:t>
+      </w:r>
+      <w:r>
+        <w:rPr>
+          <w:lang w:val="pt-BR"/>
+        </w:rPr>
+        <w:t>mos</w:t>
+      </w:r>
+      <w:r>
+        <w:rPr>
+          <w:lang w:val="pt-BR"/>
+        </w:rPr>
+        <w:t xml:space="preserve"> um plano de segurança de dados para minimizar esse risco.</w:t>
       </w:r>
       <w:r>
         <w:rPr>
@@ -352,19 +483,33 @@
         <w:rPr>
           <w:lang w:val="pt-BR"/>
         </w:rPr>
-        <w:t>Você receberá um cartão-presente da Amazon no valor de US$</w:t>
-      </w:r>
-      <w:r>
-        <w:rPr>
-          <w:lang w:val="pt-BR"/>
-        </w:rPr>
-        <w:t>20</w:t>
-      </w:r>
-      <w:r>
-        <w:rPr>
-          <w:lang w:val="pt-BR"/>
-        </w:rPr>
-        <w:t xml:space="preserve"> por completar o estudo.</w:t>
+        <w:t xml:space="preserve">Você receberá um cartão-presente da </w:t>
+      </w:r>
+      <w:proofErr w:type="spellStart"/>
+      <w:r>
+        <w:rPr>
+          <w:lang w:val="pt-BR"/>
+        </w:rPr>
+        <w:t>Amazon</w:t>
+      </w:r>
+      <w:proofErr w:type="spellEnd"/>
+      <w:r>
+        <w:rPr>
+          <w:lang w:val="pt-BR"/>
+        </w:rPr>
+        <w:t xml:space="preserve"> no valor de US$</w:t>
+      </w:r>
+      <w:r>
+        <w:rPr>
+          <w:lang w:val="pt-BR"/>
+        </w:rPr>
+        <w:t xml:space="preserve">XX </w:t>
+      </w:r>
+      <w:r>
+        <w:rPr>
+          <w:lang w:val="pt-BR"/>
+        </w:rPr>
+        <w:t>por completar o estudo.</w:t>
       </w:r>
     </w:p>
     <w:p>
@@ -392,6 +537,7 @@
           <w:szCs w:val="24"/>
           <w:lang w:val="pt-BR"/>
         </w:rPr>
+        <w:lastRenderedPageBreak/>
         <w:t>Como as informações sobre mim serão mantidas privadas ou confidenciais?</w:t>
       </w:r>
     </w:p>
@@ -415,8 +561,7 @@
           <w:szCs w:val="24"/>
           <w:lang w:val="pt-BR"/>
         </w:rPr>
-        <w:lastRenderedPageBreak/>
-        <w:t>Todos os esforços serão feitos para manter suas respostas confidenciais, mas não se pode garantir confidencialidade total. Todas as informações que você compartilar hoje serão armazenadas junto a um código anônimo de participante, e não ao seu nome. Além disso, nenhuma informação que possa identificá-lo(a) será incluída em qualquer apresentação ou publicação profissional.</w:t>
+        <w:t>Todos os esforços serão feitos para manter suas respostas confidenciais, mas não se pode garantir confidencialidade total. Todas as informações que você compartil</w:t>
       </w:r>
       <w:r>
         <w:rPr>
@@ -426,6 +571,26 @@
           <w:szCs w:val="24"/>
           <w:lang w:val="pt-BR"/>
         </w:rPr>
+        <w:t>h</w:t>
+      </w:r>
+      <w:r>
+        <w:rPr>
+          <w:b w:val="0"/>
+          <w:bCs w:val="0"/>
+          <w:sz w:val="24"/>
+          <w:szCs w:val="24"/>
+          <w:lang w:val="pt-BR"/>
+        </w:rPr>
+        <w:t>ar hoje serão armazenadas junto a um código anônimo de participante, e não ao seu nome. Além disso, nenhuma informação que possa identificá-lo(a) será incluída em qualquer apresentação ou publicação profissional.</w:t>
+      </w:r>
+      <w:r>
+        <w:rPr>
+          <w:b w:val="0"/>
+          <w:bCs w:val="0"/>
+          <w:sz w:val="24"/>
+          <w:szCs w:val="24"/>
+          <w:lang w:val="pt-BR"/>
+        </w:rPr>
         <w:br/>
       </w:r>
     </w:p>
@@ -511,13 +676,27 @@
           <w:rFonts w:cs="Times New Roman"/>
           <w:lang w:val="pt-BR"/>
         </w:rPr>
-        <w:t>A participação nesta pesquisa é totalmente voluntária. Você pode se recusar a participar ou decidir se retirar a qualquer momento, sem prejuízo ou perda de benefícios aos quais tem direito.</w:t>
+        <w:t xml:space="preserve">A participação </w:t>
       </w:r>
       <w:r>
         <w:rPr>
           <w:rFonts w:cs="Times New Roman"/>
           <w:lang w:val="pt-BR"/>
         </w:rPr>
+        <w:t>d</w:t>
+      </w:r>
+      <w:r>
+        <w:rPr>
+          <w:rFonts w:cs="Times New Roman"/>
+          <w:lang w:val="pt-BR"/>
+        </w:rPr>
+        <w:t>esta pesquisa é totalmente voluntária. Você pode se recusar a participar ou decidir se retirar a qualquer momento, sem prejuízo ou perda de benefícios aos quais tem direito.</w:t>
+      </w:r>
+      <w:r>
+        <w:rPr>
+          <w:rFonts w:cs="Times New Roman"/>
+          <w:lang w:val="pt-BR"/>
+        </w:rPr>
         <w:t xml:space="preserve"> </w:t>
       </w:r>
       <w:r>
@@ -525,7 +704,21 @@
           <w:rFonts w:cs="Times New Roman"/>
           <w:lang w:val="pt-BR"/>
         </w:rPr>
-        <w:t>Se você escolher participar agora, poderá mudar de ideia e retirar-se do estudo mais tarde. Você também poderá retirar seu consentimento para o uso</w:t>
+        <w:t xml:space="preserve">Se você escolher participar agora, poderá mudar de ideia e </w:t>
+      </w:r>
+      <w:r>
+        <w:rPr>
+          <w:rFonts w:cs="Times New Roman"/>
+          <w:lang w:val="pt-BR"/>
+        </w:rPr>
+        <w:t>se retirar</w:t>
+      </w:r>
+      <w:r>
+        <w:rPr>
+          <w:rFonts w:cs="Times New Roman"/>
+          <w:lang w:val="pt-BR"/>
+        </w:rPr>
+        <w:t xml:space="preserve"> do estudo mais tarde. Você também poderá retirar seu consentimento para o uso</w:t>
       </w:r>
       <w:r>
         <w:rPr>
@@ -660,25 +853,25 @@
         <w:rPr>
           <w:lang w:val="pt-BR"/>
         </w:rPr>
-        <w:t xml:space="preserve">Se tiver perguntas sobre sua participação neste estudo, você pode entrar em contato com </w:t>
-      </w:r>
-      <w:r>
-        <w:rPr>
-          <w:lang w:val="pt-BR"/>
-        </w:rPr>
-        <w:t>os Investigadores Principais, Robert Esposito (</w:t>
-      </w:r>
-      <w:r>
-        <w:rPr>
-          <w:lang w:val="pt-BR"/>
-        </w:rPr>
-        <w:t>rme70@scarletmail.rutgers.edu</w:t>
-      </w:r>
-      <w:r>
-        <w:rPr>
-          <w:lang w:val="pt-BR"/>
-        </w:rPr>
-        <w:t>) ou Kendra Dickinson: (</w:t>
+        <w:t xml:space="preserve">Se tiver perguntas sobre sua participação </w:t>
+      </w:r>
+      <w:r>
+        <w:rPr>
+          <w:lang w:val="pt-BR"/>
+        </w:rPr>
+        <w:t>d</w:t>
+      </w:r>
+      <w:r>
+        <w:rPr>
+          <w:lang w:val="pt-BR"/>
+        </w:rPr>
+        <w:t xml:space="preserve">este estudo, você pode entrar em contato com </w:t>
+      </w:r>
+      <w:r>
+        <w:rPr>
+          <w:lang w:val="pt-BR"/>
+        </w:rPr>
+        <w:t>os Investigadores Principais, Robert Esposito (EMAIL) ou Kendra Dickinson: (</w:t>
       </w:r>
       <w:hyperlink r:id="rId6" w:history="1">
         <w:r>
@@ -731,7 +924,35 @@
         <w:rPr>
           <w:lang w:val="pt-BR"/>
         </w:rPr>
-        <w:t>, ou por correspondência para 335 George Street, Liberty Plaza Suite 3200, New Brunswick, NJ 08901.</w:t>
+        <w:t xml:space="preserve">, ou por correspondência para 335 George Street, </w:t>
+      </w:r>
+      <w:proofErr w:type="spellStart"/>
+      <w:r>
+        <w:rPr>
+          <w:lang w:val="pt-BR"/>
+        </w:rPr>
+        <w:t>Liberty</w:t>
+      </w:r>
+      <w:proofErr w:type="spellEnd"/>
+      <w:r>
+        <w:rPr>
+          <w:lang w:val="pt-BR"/>
+        </w:rPr>
+        <w:t xml:space="preserve"> Plaza </w:t>
+      </w:r>
+      <w:proofErr w:type="spellStart"/>
+      <w:r>
+        <w:rPr>
+          <w:lang w:val="pt-BR"/>
+        </w:rPr>
+        <w:t>Suite</w:t>
+      </w:r>
+      <w:proofErr w:type="spellEnd"/>
+      <w:r>
+        <w:rPr>
+          <w:lang w:val="pt-BR"/>
+        </w:rPr>
+        <w:t xml:space="preserve"> 3200, New Brunswick, NJ 08901.</w:t>
       </w:r>
     </w:p>
     <w:p>
@@ -830,175 +1051,221 @@
 
 <file path=word/footer1.xml><?xml version="1.0" encoding="utf-8"?>
 <w:ftr xmlns:wpc="http://schemas.microsoft.com/office/word/2010/wordprocessingCanvas" xmlns:cx="http://schemas.microsoft.com/office/drawing/2014/chartex" xmlns:cx1="http://schemas.microsoft.com/office/drawing/2015/9/8/chartex" xmlns:cx2="http://schemas.microsoft.com/office/drawing/2015/10/21/chartex" xmlns:cx3="http://schemas.microsoft.com/office/drawing/2016/5/9/chartex" xmlns:cx4="http://schemas.microsoft.com/office/drawing/2016/5/10/chartex" xmlns:cx5="http://schemas.microsoft.com/office/drawing/2016/5/11/chartex" xmlns:cx6="http://schemas.microsoft.com/office/drawing/2016/5/12/chartex" xmlns:cx7="http://schemas.microsoft.com/office/drawing/2016/5/13/chartex" xmlns:cx8="http://schemas.microsoft.com/office/drawing/2016/5/14/chartex" xmlns:mc="http://schemas.openxmlformats.org/markup-compatibility/2006" xmlns:aink="http://schemas.microsoft.com/office/drawing/2016/ink" xmlns:am3d="http://schemas.microsoft.com/office/drawing/2017/model3d" xmlns:o="urn:schemas-microsoft-com:office:office" xmlns:oel="http://schemas.microsoft.com/office/2019/extlst" xmlns:r="http://schemas.openxmlformats.org/officeDocument/2006/relationships" xmlns:m="http://schemas.openxmlformats.org/officeDocument/2006/math" xmlns:v="urn:schemas-microsoft-com:vml" xmlns:wp14="http://schemas.microsoft.com/office/word/2010/wordprocessingDrawing" xmlns:wp="http://schemas.openxmlformats.org/drawingml/2006/wordprocessingDrawing" xmlns:w10="urn:schemas-microsoft-com:office:word" xmlns:w="http://schemas.openxmlformats.org/wordprocessingml/2006/main" xmlns:w14="http://schemas.microsoft.com/office/word/2010/wordml" xmlns:w15="http://schemas.microsoft.com/office/word/2012/wordml" xmlns:w16cex="http://schemas.microsoft.com/office/word/2018/wordml/cex" xmlns:w16cid="http://schemas.microsoft.com/office/word/2016/wordml/cid" xmlns:w16="http://schemas.microsoft.com/office/word/2018/wordml" xmlns:w16du="http://schemas.microsoft.com/office/word/2023/wordml/word16du" xmlns:w16sdtdh="http://schemas.microsoft.com/office/word/2020/wordml/sdtdatahash" xmlns:w16sdtfl="http://schemas.microsoft.com/office/word/2024/wordml/sdtformatlock" xmlns:w16se="http://schemas.microsoft.com/office/word/2015/wordml/symex" xmlns:wpg="http://schemas.microsoft.com/office/word/2010/wordprocessingGroup" xmlns:wpi="http://schemas.microsoft.com/office/word/2010/wordprocessingInk" xmlns:wne="http://schemas.microsoft.com/office/word/2006/wordml" xmlns:wps="http://schemas.microsoft.com/office/word/2010/wordprocessingShape" mc:Ignorable="w14 w15 w16se w16cid w16 w16cex w16sdtdh w16sdtfl w16du wp14">
-  <w:p>
-    <w:pPr>
-      <w:pStyle w:val="Footer"/>
-      <w:rPr>
-        <w:rFonts w:ascii="Arial" w:hAnsi="Arial" w:cs="Arial"/>
-        <w:sz w:val="16"/>
-        <w:szCs w:val="16"/>
-      </w:rPr>
-    </w:pPr>
-    <w:bookmarkStart w:id="0" w:name="_Hlk149311260"/>
-    <w:r>
-      <w:rPr>
-        <w:rFonts w:ascii="Arial" w:hAnsi="Arial" w:cs="Arial"/>
-        <w:sz w:val="16"/>
-        <w:szCs w:val="16"/>
-      </w:rPr>
-      <w:t>Protocol Title: Portuguese in New Jersey</w:t>
-    </w:r>
-  </w:p>
-  <w:p>
-    <w:pPr>
-      <w:pStyle w:val="Footer"/>
-      <w:contextualSpacing/>
-      <w:rPr>
-        <w:rFonts w:ascii="Arial" w:hAnsi="Arial" w:cs="Arial"/>
-        <w:sz w:val="16"/>
-        <w:szCs w:val="22"/>
-      </w:rPr>
-    </w:pPr>
-    <w:r>
-      <w:rPr>
-        <w:rFonts w:ascii="Arial" w:hAnsi="Arial" w:cs="Arial"/>
-        <w:sz w:val="16"/>
-        <w:szCs w:val="16"/>
-      </w:rPr>
-      <w:t xml:space="preserve">Version Date: </w:t>
-    </w:r>
-    <w:bookmarkEnd w:id="0"/>
-    <w:r>
-      <w:rPr>
-        <w:rFonts w:ascii="Arial" w:hAnsi="Arial" w:cs="Arial"/>
-        <w:sz w:val="16"/>
-        <w:szCs w:val="16"/>
-      </w:rPr>
-      <w:t>06.14.2026</w:t>
-    </w:r>
-  </w:p>
-  <w:p>
-    <w:pPr>
-      <w:pStyle w:val="Footer"/>
-      <w:contextualSpacing/>
-      <w:rPr>
-        <w:rFonts w:ascii="Arial" w:hAnsi="Arial" w:cs="Arial"/>
-        <w:sz w:val="16"/>
-        <w:szCs w:val="22"/>
-      </w:rPr>
-    </w:pPr>
-    <w:r>
-      <w:rPr>
-        <w:rFonts w:ascii="Arial" w:hAnsi="Arial" w:cs="Arial"/>
-        <w:sz w:val="16"/>
-        <w:szCs w:val="22"/>
-      </w:rPr>
-      <w:t xml:space="preserve">Page </w:t>
-    </w:r>
-    <w:r>
-      <w:rPr>
-        <w:rFonts w:ascii="Arial" w:hAnsi="Arial" w:cs="Arial"/>
-        <w:b/>
-        <w:sz w:val="16"/>
-        <w:szCs w:val="22"/>
-      </w:rPr>
-      <w:fldChar w:fldCharType="begin"/>
-    </w:r>
-    <w:r>
-      <w:rPr>
-        <w:rFonts w:ascii="Arial" w:hAnsi="Arial" w:cs="Arial"/>
-        <w:b/>
-        <w:sz w:val="16"/>
-        <w:szCs w:val="22"/>
-      </w:rPr>
-      <w:instrText xml:space="preserve"> PAGE </w:instrText>
-    </w:r>
-    <w:r>
-      <w:rPr>
-        <w:rFonts w:ascii="Arial" w:hAnsi="Arial" w:cs="Arial"/>
-        <w:b/>
-        <w:sz w:val="16"/>
-        <w:szCs w:val="22"/>
-      </w:rPr>
-      <w:fldChar w:fldCharType="separate"/>
-    </w:r>
-    <w:r>
-      <w:rPr>
-        <w:rFonts w:ascii="Arial" w:hAnsi="Arial" w:cs="Arial"/>
-        <w:b/>
-        <w:sz w:val="16"/>
-        <w:szCs w:val="22"/>
-      </w:rPr>
-      <w:t>2</w:t>
-    </w:r>
-    <w:r>
-      <w:rPr>
-        <w:rFonts w:ascii="Arial" w:hAnsi="Arial" w:cs="Arial"/>
-        <w:b/>
-        <w:sz w:val="16"/>
-        <w:szCs w:val="22"/>
-      </w:rPr>
-      <w:fldChar w:fldCharType="end"/>
-    </w:r>
-    <w:r>
-      <w:rPr>
-        <w:rFonts w:ascii="Arial" w:hAnsi="Arial" w:cs="Arial"/>
-        <w:sz w:val="16"/>
-        <w:szCs w:val="22"/>
-      </w:rPr>
-      <w:t xml:space="preserve"> of </w:t>
-    </w:r>
-    <w:r>
-      <w:rPr>
-        <w:rFonts w:ascii="Arial" w:hAnsi="Arial" w:cs="Arial"/>
-        <w:b/>
-        <w:sz w:val="16"/>
-        <w:szCs w:val="22"/>
-      </w:rPr>
-      <w:fldChar w:fldCharType="begin"/>
-    </w:r>
-    <w:r>
-      <w:rPr>
-        <w:rFonts w:ascii="Arial" w:hAnsi="Arial" w:cs="Arial"/>
-        <w:b/>
-        <w:sz w:val="16"/>
-        <w:szCs w:val="22"/>
-      </w:rPr>
-      <w:instrText xml:space="preserve"> NUMPAGES  </w:instrText>
-    </w:r>
-    <w:r>
-      <w:rPr>
-        <w:rFonts w:ascii="Arial" w:hAnsi="Arial" w:cs="Arial"/>
-        <w:b/>
-        <w:sz w:val="16"/>
-        <w:szCs w:val="22"/>
-      </w:rPr>
-      <w:fldChar w:fldCharType="separate"/>
-    </w:r>
-    <w:r>
-      <w:rPr>
-        <w:rFonts w:ascii="Arial" w:hAnsi="Arial" w:cs="Arial"/>
-        <w:b/>
-        <w:sz w:val="16"/>
-        <w:szCs w:val="22"/>
-      </w:rPr>
-      <w:t>2</w:t>
-    </w:r>
-    <w:r>
-      <w:rPr>
-        <w:rFonts w:ascii="Arial" w:hAnsi="Arial" w:cs="Arial"/>
-        <w:b/>
-        <w:sz w:val="16"/>
-        <w:szCs w:val="22"/>
-      </w:rPr>
-      <w:fldChar w:fldCharType="end"/>
-    </w:r>
-  </w:p>
-  <w:p>
-    <w:pPr>
-      <w:pStyle w:val="Footer"/>
-    </w:pPr>
-  </w:p>
+  <w:tbl>
+    <w:tblPr>
+      <w:tblW w:w="0" w:type="auto"/>
+      <w:tblLook w:val="06A0" w:firstRow="1" w:lastRow="0" w:firstColumn="1" w:lastColumn="0" w:noHBand="1" w:noVBand="1"/>
+    </w:tblPr>
+    <w:tblGrid>
+      <w:gridCol w:w="3120"/>
+      <w:gridCol w:w="3120"/>
+      <w:gridCol w:w="3120"/>
+    </w:tblGrid>
+    <w:tr>
+      <w:trPr>
+        <w:trHeight w:val="300"/>
+      </w:trPr>
+      <w:tc>
+        <w:tcPr>
+          <w:tcW w:w="3120" w:type="dxa"/>
+        </w:tcPr>
+        <w:p>
+          <w:pPr>
+            <w:pStyle w:val="Footer"/>
+            <w:contextualSpacing/>
+            <w:rPr>
+              <w:rFonts w:ascii="Arial" w:hAnsi="Arial" w:cs="Arial"/>
+              <w:sz w:val="16"/>
+              <w:szCs w:val="22"/>
+            </w:rPr>
+          </w:pPr>
+          <w:r>
+            <w:rPr>
+              <w:rFonts w:ascii="Arial" w:hAnsi="Arial" w:cs="Arial"/>
+              <w:sz w:val="16"/>
+              <w:szCs w:val="22"/>
+            </w:rPr>
+            <w:t xml:space="preserve">Study Informed Consent Version: </w:t>
+          </w:r>
+        </w:p>
+        <w:p>
+          <w:pPr>
+            <w:pStyle w:val="Footer"/>
+            <w:contextualSpacing/>
+            <w:rPr>
+              <w:rFonts w:ascii="Arial" w:hAnsi="Arial" w:cs="Arial"/>
+              <w:sz w:val="16"/>
+              <w:szCs w:val="16"/>
+            </w:rPr>
+          </w:pPr>
+          <w:proofErr w:type="spellStart"/>
+          <w:r>
+            <w:rPr>
+              <w:rFonts w:ascii="Arial" w:hAnsi="Arial" w:cs="Arial"/>
+              <w:sz w:val="16"/>
+              <w:szCs w:val="16"/>
+            </w:rPr>
+            <w:t>rCR</w:t>
+          </w:r>
+          <w:proofErr w:type="spellEnd"/>
+          <w:r>
+            <w:rPr>
+              <w:rFonts w:ascii="Arial" w:hAnsi="Arial" w:cs="Arial"/>
+              <w:sz w:val="16"/>
+              <w:szCs w:val="16"/>
+            </w:rPr>
+            <w:t xml:space="preserve"> Consent Template for Interview Research 1.11.22</w:t>
+          </w:r>
+        </w:p>
+        <w:p>
+          <w:pPr>
+            <w:pStyle w:val="Footer"/>
+            <w:contextualSpacing/>
+            <w:rPr>
+              <w:rFonts w:ascii="Arial" w:hAnsi="Arial" w:cs="Arial"/>
+              <w:sz w:val="16"/>
+              <w:szCs w:val="22"/>
+            </w:rPr>
+          </w:pPr>
+          <w:r>
+            <w:rPr>
+              <w:rFonts w:ascii="Arial" w:hAnsi="Arial" w:cs="Arial"/>
+              <w:sz w:val="16"/>
+              <w:szCs w:val="22"/>
+            </w:rPr>
+            <w:t xml:space="preserve">Page </w:t>
+          </w:r>
+          <w:r>
+            <w:rPr>
+              <w:rFonts w:ascii="Arial" w:hAnsi="Arial" w:cs="Arial"/>
+              <w:b/>
+              <w:sz w:val="16"/>
+              <w:szCs w:val="22"/>
+            </w:rPr>
+            <w:fldChar w:fldCharType="begin"/>
+          </w:r>
+          <w:r>
+            <w:rPr>
+              <w:rFonts w:ascii="Arial" w:hAnsi="Arial" w:cs="Arial"/>
+              <w:b/>
+              <w:sz w:val="16"/>
+              <w:szCs w:val="22"/>
+            </w:rPr>
+            <w:instrText xml:space="preserve"> PAGE </w:instrText>
+          </w:r>
+          <w:r>
+            <w:rPr>
+              <w:rFonts w:ascii="Arial" w:hAnsi="Arial" w:cs="Arial"/>
+              <w:b/>
+              <w:sz w:val="16"/>
+              <w:szCs w:val="22"/>
+            </w:rPr>
+            <w:fldChar w:fldCharType="separate"/>
+          </w:r>
+          <w:r>
+            <w:rPr>
+              <w:rFonts w:ascii="Arial" w:hAnsi="Arial" w:cs="Arial"/>
+              <w:b/>
+              <w:sz w:val="16"/>
+              <w:szCs w:val="22"/>
+            </w:rPr>
+            <w:t>1</w:t>
+          </w:r>
+          <w:r>
+            <w:rPr>
+              <w:rFonts w:ascii="Arial" w:hAnsi="Arial" w:cs="Arial"/>
+              <w:b/>
+              <w:sz w:val="16"/>
+              <w:szCs w:val="22"/>
+            </w:rPr>
+            <w:fldChar w:fldCharType="end"/>
+          </w:r>
+          <w:r>
+            <w:rPr>
+              <w:rFonts w:ascii="Arial" w:hAnsi="Arial" w:cs="Arial"/>
+              <w:sz w:val="16"/>
+              <w:szCs w:val="22"/>
+            </w:rPr>
+            <w:t xml:space="preserve"> of </w:t>
+          </w:r>
+          <w:r>
+            <w:rPr>
+              <w:rFonts w:ascii="Arial" w:hAnsi="Arial" w:cs="Arial"/>
+              <w:b/>
+              <w:sz w:val="16"/>
+              <w:szCs w:val="22"/>
+            </w:rPr>
+            <w:fldChar w:fldCharType="begin"/>
+          </w:r>
+          <w:r>
+            <w:rPr>
+              <w:rFonts w:ascii="Arial" w:hAnsi="Arial" w:cs="Arial"/>
+              <w:b/>
+              <w:sz w:val="16"/>
+              <w:szCs w:val="22"/>
+            </w:rPr>
+            <w:instrText xml:space="preserve"> NUMPAGES  </w:instrText>
+          </w:r>
+          <w:r>
+            <w:rPr>
+              <w:rFonts w:ascii="Arial" w:hAnsi="Arial" w:cs="Arial"/>
+              <w:b/>
+              <w:sz w:val="16"/>
+              <w:szCs w:val="22"/>
+            </w:rPr>
+            <w:fldChar w:fldCharType="separate"/>
+          </w:r>
+          <w:r>
+            <w:rPr>
+              <w:rFonts w:ascii="Arial" w:hAnsi="Arial" w:cs="Arial"/>
+              <w:b/>
+              <w:sz w:val="16"/>
+              <w:szCs w:val="22"/>
+            </w:rPr>
+            <w:t>2</w:t>
+          </w:r>
+          <w:r>
+            <w:rPr>
+              <w:rFonts w:ascii="Arial" w:hAnsi="Arial" w:cs="Arial"/>
+              <w:b/>
+              <w:sz w:val="16"/>
+              <w:szCs w:val="22"/>
+            </w:rPr>
+            <w:fldChar w:fldCharType="end"/>
+          </w:r>
+        </w:p>
+        <w:p>
+          <w:pPr>
+            <w:pStyle w:val="Header"/>
+            <w:ind w:left="-115"/>
+          </w:pPr>
+        </w:p>
+      </w:tc>
+      <w:tc>
+        <w:tcPr>
+          <w:tcW w:w="3120" w:type="dxa"/>
+        </w:tcPr>
+        <w:p>
+          <w:pPr>
+            <w:pStyle w:val="Header"/>
+            <w:jc w:val="center"/>
+          </w:pPr>
+        </w:p>
+      </w:tc>
+      <w:tc>
+        <w:tcPr>
+          <w:tcW w:w="3120" w:type="dxa"/>
+        </w:tcPr>
+        <w:p>
+          <w:pPr>
+            <w:pStyle w:val="Header"/>
+            <w:ind w:right="-115"/>
+            <w:jc w:val="right"/>
+          </w:pPr>
+        </w:p>
+      </w:tc>
+    </w:tr>
+  </w:tbl>
   <w:p>
     <w:pPr>
       <w:pStyle w:val="Footer"/>
@@ -1746,6 +2013,16 @@
       <w:shd w:val="clear" w:color="auto" w:fill="E1DFDD"/>
     </w:rPr>
   </w:style>
+  <w:style w:type="paragraph" w:styleId="Revision">
+    <w:name w:val="Revision"/>
+    <w:hidden/>
+    <w:uiPriority w:val="99"/>
+    <w:semiHidden/>
+    <w:rsid w:val="008E3A00"/>
+    <w:pPr>
+      <w:spacing w:after="0" w:line="240" w:lineRule="auto"/>
+    </w:pPr>
+  </w:style>
 </w:styles>
 </file>
 

</xml_diff>